<commit_message>
feat: add physical exam template and fix lab workflow
</commit_message>
<xml_diff>
--- a/coshare_patientrecord_sys_backend/src/main/resources/pre-ai-templates/pre-ai-final-template-v2.docx
+++ b/coshare_patientrecord_sys_backend/src/main/resources/pre-ai-templates/pre-ai-final-template-v2.docx
@@ -9973,6 +9973,21 @@
       <w:cols w:space="720" w:num="1"/>
       <w:docGrid w:type="lines" w:linePitch="312" w:charSpace="0"/>
     </w:sectPr>
+    <w:p>
+      <w:pPr>
+        <w:rPr>
+          <w:vanish/>
+        </w:rPr>
+      </w:pPr>
+      <w:bookmarkStart w:id="130" w:name="PREAI_S13"/>
+      <w:r>
+        <w:rPr>
+          <w:vanish/>
+        </w:rPr>
+        <w:t>PREAI_S13</w:t>
+      </w:r>
+      <w:bookmarkEnd w:id="130"/>
+    </w:p>
   </w:body>
 </w:document>
 </file>

</xml_diff>